<commit_message>
adding happy heart rate extractions and sens analyses
</commit_message>
<xml_diff>
--- a/sos-bioreactivity-supplement.docx
+++ b/sos-bioreactivity-supplement.docx
@@ -41,7 +41,7 @@
         <w:pStyle w:val="Date"/>
       </w:pPr>
       <w:r>
-        <w:t xml:space="preserve">2026-09-18</w:t>
+        <w:t xml:space="preserve">2026-10-14</w:t>
       </w:r>
     </w:p>
     <w:sdt>
@@ -11732,7 +11732,7 @@
     </w:p>
     <w:bookmarkEnd w:id="38"/>
     <w:bookmarkEnd w:id="39"/>
-    <w:bookmarkStart w:id="100" w:name="sensitivity-analyses"/>
+    <w:bookmarkStart w:id="103" w:name="sensitivity-analyses"/>
     <w:p>
       <w:pPr>
         <w:pStyle w:val="Heading1"/>
@@ -71523,16 +71523,937 @@
     </w:p>
     <w:bookmarkEnd w:id="95"/>
     <w:bookmarkEnd w:id="96"/>
-    <w:bookmarkStart w:id="99" w:name="cross-check"/>
+    <w:bookmarkStart w:id="99" w:name="X07bdfa35ae1ff0bed89c84a838fcd3547699720"/>
     <w:p>
       <w:pPr>
         <w:pStyle w:val="Heading2"/>
       </w:pPr>
       <w:r>
+        <w:t xml:space="preserve">S6: HAPPY (BOLD-Derived) Heart Rate Validation</w:t>
+      </w:r>
+    </w:p>
+    <w:p>
+      <w:pPr>
+        <w:pStyle w:val="FirstParagraph"/>
+      </w:pPr>
+      <w:r>
+        <w:rPr>
+          <w:i/>
+          <w:iCs/>
+        </w:rPr>
+        <w:t xml:space="preserve">Rationale.</w:t>
+      </w:r>
+      <w:r>
+        <w:t xml:space="preserve"> </w:t>
+      </w:r>
+      <w:r>
+        <w:t xml:space="preserve">The primary heart rate measures (Aim 1b) come from dedicated physio recording during</w:t>
+      </w:r>
+      <w:r>
+        <w:t xml:space="preserve"> </w:t>
+      </w:r>
+      <w:r>
+        <w:t xml:space="preserve">the scan. Separately, HAPPY (a method for extracting a pulse/heart-rate signal directly from the</w:t>
+      </w:r>
+      <w:r>
+        <w:t xml:space="preserve"> </w:t>
+      </w:r>
+      <w:r>
+        <w:t xml:space="preserve">BOLD fMRI time series itself) was used to derive resting and task heart rate for most participants,</w:t>
+      </w:r>
+      <w:r>
+        <w:t xml:space="preserve"> </w:t>
+      </w:r>
+      <w:r>
+        <w:t xml:space="preserve">including many of the early participants who lack physio-recorded HR entirely (see the HR Subsample</w:t>
+      </w:r>
+      <w:r>
+        <w:t xml:space="preserve"> </w:t>
+      </w:r>
+      <w:r>
+        <w:t xml:space="preserve">Comparison and Missing Data Summary sections above – physio HR monitoring was not part of the</w:t>
+      </w:r>
+      <w:r>
+        <w:t xml:space="preserve"> </w:t>
+      </w:r>
+      <w:r>
+        <w:t xml:space="preserve">protocol until several months into data collection). HAPPY currently provides only overall</w:t>
+      </w:r>
+      <w:r>
+        <w:t xml:space="preserve"> </w:t>
+      </w:r>
+      <w:r>
+        <w:t xml:space="preserve">rest-vs-task heart rate, not the within-task condition breakdown (Self-Connected/Self-Disconnected/</w:t>
+      </w:r>
+      <w:r>
+        <w:t xml:space="preserve"> </w:t>
+      </w:r>
+      <w:r>
+        <w:t xml:space="preserve">Other/Fixation-Cross). This section (1) checks agreement between the two methods in the participants</w:t>
+      </w:r>
+      <w:r>
+        <w:t xml:space="preserve"> </w:t>
+      </w:r>
+      <w:r>
+        <w:t xml:space="preserve">who have both, and (2) re-runs the primary task-vs-rest comparison using the full HAPPY sample, which</w:t>
+      </w:r>
+      <w:r>
+        <w:t xml:space="preserve"> </w:t>
+      </w:r>
+      <w:r>
+        <w:t xml:space="preserve">is substantially larger than the physio-only sample.</w:t>
+      </w:r>
+    </w:p>
+    <w:bookmarkStart w:id="97" w:name="reliability-original-vs.-happy"/>
+    <w:p>
+      <w:pPr>
+        <w:pStyle w:val="Heading3"/>
+      </w:pPr>
+      <w:r>
+        <w:t xml:space="preserve">Reliability: Original vs. HAPPY</w:t>
+      </w:r>
+    </w:p>
+    <w:p>
+      <w:pPr>
+        <w:pStyle w:val="TableCaption"/>
+      </w:pPr>
+      <w:r>
+        <w:t xml:space="preserve">Agreement between original (physio) and HAPPY (BOLD-derived) heart rate</w:t>
+      </w:r>
+    </w:p>
+    <w:tbl>
+      <w:tblPr>
+        <w:tblStyle w:val="Table"/>
+        <w:tblW w:type="pct" w:w="5000"/>
+        <w:tblLayout w:type="fixed"/>
+        <w:tblLook w:firstRow="1" w:lastRow="0" w:firstColumn="0" w:lastColumn="0" w:noHBand="0" w:noVBand="0" w:val="0020"/>
+        <w:tblCaption w:val="Agreement between original (physio) and HAPPY (BOLD-derived) heart rate"/>
+      </w:tblPr>
+      <w:tblGrid>
+        <w:gridCol w:w="1903"/>
+        <w:gridCol w:w="228"/>
+        <w:gridCol w:w="456"/>
+        <w:gridCol w:w="456"/>
+        <w:gridCol w:w="1142"/>
+        <w:gridCol w:w="2208"/>
+        <w:gridCol w:w="1523"/>
+      </w:tblGrid>
+      <w:tr>
+        <w:trPr>
+          <w:tblHeader w:val="on"/>
+        </w:trPr>
+        <w:tc>
+          <w:tcPr/>
+          <w:p>
+            <w:pPr>
+              <w:pStyle w:val="Compact"/>
+              <w:jc w:val="left"/>
+            </w:pPr>
+            <w:r>
+              <w:t xml:space="preserve">Measure</w:t>
+            </w:r>
+          </w:p>
+        </w:tc>
+        <w:tc>
+          <w:tcPr/>
+          <w:p>
+            <w:pPr>
+              <w:pStyle w:val="Compact"/>
+              <w:jc w:val="right"/>
+            </w:pPr>
+            <w:r>
+              <w:t xml:space="preserve">n</w:t>
+            </w:r>
+          </w:p>
+        </w:tc>
+        <w:tc>
+          <w:tcPr/>
+          <w:p>
+            <w:pPr>
+              <w:pStyle w:val="Compact"/>
+              <w:jc w:val="right"/>
+            </w:pPr>
+            <w:r>
+              <w:t xml:space="preserve">r</w:t>
+            </w:r>
+          </w:p>
+        </w:tc>
+        <w:tc>
+          <w:tcPr/>
+          <w:p>
+            <w:pPr>
+              <w:pStyle w:val="Compact"/>
+              <w:jc w:val="right"/>
+            </w:pPr>
+            <w:r>
+              <w:t xml:space="preserve">ICC</w:t>
+            </w:r>
+          </w:p>
+        </w:tc>
+        <w:tc>
+          <w:tcPr/>
+          <w:p>
+            <w:pPr>
+              <w:pStyle w:val="Compact"/>
+              <w:jc w:val="left"/>
+            </w:pPr>
+            <w:r>
+              <w:t xml:space="preserve">ICC 95% CI</w:t>
+            </w:r>
+          </w:p>
+        </w:tc>
+        <w:tc>
+          <w:tcPr/>
+          <w:p>
+            <w:pPr>
+              <w:pStyle w:val="Compact"/>
+              <w:jc w:val="right"/>
+            </w:pPr>
+            <w:r>
+              <w:t xml:space="preserve">Mean bias (HAPPY - original)</w:t>
+            </w:r>
+          </w:p>
+        </w:tc>
+        <w:tc>
+          <w:tcPr/>
+          <w:p>
+            <w:pPr>
+              <w:pStyle w:val="Compact"/>
+              <w:jc w:val="left"/>
+            </w:pPr>
+            <w:r>
+              <w:t xml:space="preserve">Limits of agreement</w:t>
+            </w:r>
+          </w:p>
+        </w:tc>
+      </w:tr>
+      <w:tr>
+        <w:tc>
+          <w:tcPr/>
+          <w:p>
+            <w:pPr>
+              <w:pStyle w:val="Compact"/>
+              <w:jc w:val="left"/>
+            </w:pPr>
+            <w:r>
+              <w:t xml:space="preserve">Resting HR</w:t>
+            </w:r>
+          </w:p>
+        </w:tc>
+        <w:tc>
+          <w:tcPr/>
+          <w:p>
+            <w:pPr>
+              <w:pStyle w:val="Compact"/>
+              <w:jc w:val="right"/>
+            </w:pPr>
+            <w:r>
+              <w:t xml:space="preserve">49</w:t>
+            </w:r>
+          </w:p>
+        </w:tc>
+        <w:tc>
+          <w:tcPr/>
+          <w:p>
+            <w:pPr>
+              <w:pStyle w:val="Compact"/>
+              <w:jc w:val="right"/>
+            </w:pPr>
+            <w:r>
+              <w:t xml:space="preserve">0.996</w:t>
+            </w:r>
+          </w:p>
+        </w:tc>
+        <w:tc>
+          <w:tcPr/>
+          <w:p>
+            <w:pPr>
+              <w:pStyle w:val="Compact"/>
+              <w:jc w:val="right"/>
+            </w:pPr>
+            <w:r>
+              <w:t xml:space="preserve">0.993</w:t>
+            </w:r>
+          </w:p>
+        </w:tc>
+        <w:tc>
+          <w:tcPr/>
+          <w:p>
+            <w:pPr>
+              <w:pStyle w:val="Compact"/>
+              <w:jc w:val="left"/>
+            </w:pPr>
+            <w:r>
+              <w:t xml:space="preserve">[0.959, 0.998]</w:t>
+            </w:r>
+          </w:p>
+        </w:tc>
+        <w:tc>
+          <w:tcPr/>
+          <w:p>
+            <w:pPr>
+              <w:pStyle w:val="Compact"/>
+              <w:jc w:val="right"/>
+            </w:pPr>
+            <w:r>
+              <w:t xml:space="preserve">0.61</w:t>
+            </w:r>
+          </w:p>
+        </w:tc>
+        <w:tc>
+          <w:tcPr/>
+          <w:p>
+            <w:pPr>
+              <w:pStyle w:val="Compact"/>
+              <w:jc w:val="left"/>
+            </w:pPr>
+            <w:r>
+              <w:t xml:space="preserve">[-0.74, 1.96]</w:t>
+            </w:r>
+          </w:p>
+        </w:tc>
+      </w:tr>
+      <w:tr>
+        <w:tc>
+          <w:tcPr/>
+          <w:p>
+            <w:pPr>
+              <w:pStyle w:val="Compact"/>
+              <w:jc w:val="left"/>
+            </w:pPr>
+            <w:r>
+              <w:t xml:space="preserve">Task HR</w:t>
+            </w:r>
+          </w:p>
+        </w:tc>
+        <w:tc>
+          <w:tcPr/>
+          <w:p>
+            <w:pPr>
+              <w:pStyle w:val="Compact"/>
+              <w:jc w:val="right"/>
+            </w:pPr>
+            <w:r>
+              <w:t xml:space="preserve">49</w:t>
+            </w:r>
+          </w:p>
+        </w:tc>
+        <w:tc>
+          <w:tcPr/>
+          <w:p>
+            <w:pPr>
+              <w:pStyle w:val="Compact"/>
+              <w:jc w:val="right"/>
+            </w:pPr>
+            <w:r>
+              <w:t xml:space="preserve">0.996</w:t>
+            </w:r>
+          </w:p>
+        </w:tc>
+        <w:tc>
+          <w:tcPr/>
+          <w:p>
+            <w:pPr>
+              <w:pStyle w:val="Compact"/>
+              <w:jc w:val="right"/>
+            </w:pPr>
+            <w:r>
+              <w:t xml:space="preserve">0.995</w:t>
+            </w:r>
+          </w:p>
+        </w:tc>
+        <w:tc>
+          <w:tcPr/>
+          <w:p>
+            <w:pPr>
+              <w:pStyle w:val="Compact"/>
+              <w:jc w:val="left"/>
+            </w:pPr>
+            <w:r>
+              <w:t xml:space="preserve">[0.992, 0.997]</w:t>
+            </w:r>
+          </w:p>
+        </w:tc>
+        <w:tc>
+          <w:tcPr/>
+          <w:p>
+            <w:pPr>
+              <w:pStyle w:val="Compact"/>
+              <w:jc w:val="right"/>
+            </w:pPr>
+            <w:r>
+              <w:t xml:space="preserve">-0.17</w:t>
+            </w:r>
+          </w:p>
+        </w:tc>
+        <w:tc>
+          <w:tcPr/>
+          <w:p>
+            <w:pPr>
+              <w:pStyle w:val="Compact"/>
+              <w:jc w:val="left"/>
+            </w:pPr>
+            <w:r>
+              <w:t xml:space="preserve">[-1.94, 1.6]</w:t>
+            </w:r>
+          </w:p>
+        </w:tc>
+      </w:tr>
+      <w:tr>
+        <w:tc>
+          <w:tcPr/>
+          <w:p>
+            <w:pPr>
+              <w:pStyle w:val="Compact"/>
+              <w:jc w:val="left"/>
+            </w:pPr>
+            <w:r>
+              <w:t xml:space="preserve">Task − Rest (reactivity)</w:t>
+            </w:r>
+          </w:p>
+        </w:tc>
+        <w:tc>
+          <w:tcPr/>
+          <w:p>
+            <w:pPr>
+              <w:pStyle w:val="Compact"/>
+              <w:jc w:val="right"/>
+            </w:pPr>
+            <w:r>
+              <w:t xml:space="preserve">49</w:t>
+            </w:r>
+          </w:p>
+        </w:tc>
+        <w:tc>
+          <w:tcPr/>
+          <w:p>
+            <w:pPr>
+              <w:pStyle w:val="Compact"/>
+              <w:jc w:val="right"/>
+            </w:pPr>
+            <w:r>
+              <w:t xml:space="preserve">0.964</w:t>
+            </w:r>
+          </w:p>
+        </w:tc>
+        <w:tc>
+          <w:tcPr/>
+          <w:p>
+            <w:pPr>
+              <w:pStyle w:val="Compact"/>
+              <w:jc w:val="right"/>
+            </w:pPr>
+            <w:r>
+              <w:t xml:space="preserve">0.945</w:t>
+            </w:r>
+          </w:p>
+        </w:tc>
+        <w:tc>
+          <w:tcPr/>
+          <w:p>
+            <w:pPr>
+              <w:pStyle w:val="Compact"/>
+              <w:jc w:val="left"/>
+            </w:pPr>
+            <w:r>
+              <w:t xml:space="preserve">[0.798, 0.978]</w:t>
+            </w:r>
+          </w:p>
+        </w:tc>
+        <w:tc>
+          <w:tcPr/>
+          <w:p>
+            <w:pPr>
+              <w:pStyle w:val="Compact"/>
+              <w:jc w:val="right"/>
+            </w:pPr>
+            <w:r>
+              <w:t xml:space="preserve">-0.78</w:t>
+            </w:r>
+          </w:p>
+        </w:tc>
+        <w:tc>
+          <w:tcPr/>
+          <w:p>
+            <w:pPr>
+              <w:pStyle w:val="Compact"/>
+              <w:jc w:val="left"/>
+            </w:pPr>
+            <w:r>
+              <w:t xml:space="preserve">[-2.83, 1.27]</w:t>
+            </w:r>
+          </w:p>
+        </w:tc>
+      </w:tr>
+    </w:tbl>
+    <w:p>
+      <w:pPr>
+        <w:pStyle w:val="BodyText"/>
+      </w:pPr>
+      <w:r>
+        <w:rPr>
+          <w:b/>
+          <w:bCs/>
+        </w:rPr>
+        <w:t xml:space="preserve">Results.</w:t>
+      </w:r>
+      <w:r>
+        <w:t xml:space="preserve"> </w:t>
+      </w:r>
+      <w:r>
+        <w:t xml:space="preserve">Of the 76-person biomarker sample, 49 have heart rate from both methods. Resting HR (ICC = 0.993) and task HR (ICC = 0.995) show excellent agreement; the task-minus-rest reactivity score, which compounds measurement error from both components, is somewhat lower but still excellent (ICC = 0.945). Bias is small in absolute terms for all three measures (see table). As a further check, the primary Aim 1b finding replicates directly in the HAPPY data for this same subsample: task HR significantly exceeds resting HR (</w:t>
+      </w:r>
+      <w:r>
+        <w:rPr>
+          <w:i/>
+          <w:iCs/>
+        </w:rPr>
+        <w:t xml:space="preserve">t</w:t>
+      </w:r>
+      <w:r>
+        <w:t xml:space="preserve">(48) = 5.66,</w:t>
+      </w:r>
+      <w:r>
+        <w:t xml:space="preserve"> </w:t>
+      </w:r>
+      <w:r>
+        <w:rPr>
+          <w:i/>
+          <w:iCs/>
+        </w:rPr>
+        <w:t xml:space="preserve">p</w:t>
+      </w:r>
+      <w:r>
+        <w:t xml:space="preserve"> </w:t>
+      </w:r>
+      <w:r>
+        <w:t xml:space="preserve">&lt; .001, mean diff = 3.17 bpm).</w:t>
+      </w:r>
+    </w:p>
+    <w:bookmarkEnd w:id="97"/>
+    <w:bookmarkStart w:id="98" w:name="Xa6661f3d0d4f4eb27da94e0160fdd71892f035d"/>
+    <w:p>
+      <w:pPr>
+        <w:pStyle w:val="Heading3"/>
+      </w:pPr>
+      <w:r>
+        <w:t xml:space="preserve">Task vs. Rest Using the Full HAPPY Sample</w:t>
+      </w:r>
+    </w:p>
+    <w:p>
+      <w:pPr>
+        <w:pStyle w:val="TableCaption"/>
+      </w:pPr>
+      <w:r>
+        <w:t xml:space="preserve">Task vs. rest heart rate using the full HAPPY sample (of the biomarker sample)</w:t>
+      </w:r>
+    </w:p>
+    <w:tbl>
+      <w:tblPr>
+        <w:tblStyle w:val="Table"/>
+        <w:tblW w:type="pct" w:w="5000"/>
+        <w:tblLayout w:type="fixed"/>
+        <w:tblLook w:firstRow="1" w:lastRow="0" w:firstColumn="0" w:lastColumn="0" w:noHBand="0" w:noVBand="0" w:val="0020"/>
+        <w:tblCaption w:val="Task vs. rest heart rate using the full HAPPY sample (of the biomarker sample)"/>
+      </w:tblPr>
+      <w:tblGrid>
+        <w:gridCol w:w="2587"/>
+        <w:gridCol w:w="235"/>
+        <w:gridCol w:w="1411"/>
+        <w:gridCol w:w="1176"/>
+        <w:gridCol w:w="470"/>
+        <w:gridCol w:w="235"/>
+        <w:gridCol w:w="548"/>
+        <w:gridCol w:w="1254"/>
+      </w:tblGrid>
+      <w:tr>
+        <w:trPr>
+          <w:tblHeader w:val="on"/>
+        </w:trPr>
+        <w:tc>
+          <w:tcPr/>
+          <w:p>
+            <w:pPr>
+              <w:pStyle w:val="Compact"/>
+              <w:jc w:val="left"/>
+            </w:pPr>
+            <w:r>
+              <w:t xml:space="preserve">Sample</w:t>
+            </w:r>
+          </w:p>
+        </w:tc>
+        <w:tc>
+          <w:tcPr/>
+          <w:p>
+            <w:pPr>
+              <w:pStyle w:val="Compact"/>
+              <w:jc w:val="right"/>
+            </w:pPr>
+            <w:r>
+              <w:t xml:space="preserve">n</w:t>
+            </w:r>
+          </w:p>
+        </w:tc>
+        <w:tc>
+          <w:tcPr/>
+          <w:p>
+            <w:pPr>
+              <w:pStyle w:val="Compact"/>
+              <w:jc w:val="left"/>
+            </w:pPr>
+            <w:r>
+              <w:t xml:space="preserve">Resting HR M (SD)</w:t>
+            </w:r>
+          </w:p>
+        </w:tc>
+        <w:tc>
+          <w:tcPr/>
+          <w:p>
+            <w:pPr>
+              <w:pStyle w:val="Compact"/>
+              <w:jc w:val="left"/>
+            </w:pPr>
+            <w:r>
+              <w:t xml:space="preserve">Task HR M (SD)</w:t>
+            </w:r>
+          </w:p>
+        </w:tc>
+        <w:tc>
+          <w:tcPr/>
+          <w:p>
+            <w:pPr>
+              <w:pStyle w:val="Compact"/>
+              <w:jc w:val="right"/>
+            </w:pPr>
+            <w:r>
+              <w:t xml:space="preserve">t</w:t>
+            </w:r>
+          </w:p>
+        </w:tc>
+        <w:tc>
+          <w:tcPr/>
+          <w:p>
+            <w:pPr>
+              <w:pStyle w:val="Compact"/>
+              <w:jc w:val="right"/>
+            </w:pPr>
+            <w:r>
+              <w:t xml:space="preserve">df</w:t>
+            </w:r>
+          </w:p>
+        </w:tc>
+        <w:tc>
+          <w:tcPr/>
+          <w:p>
+            <w:pPr>
+              <w:pStyle w:val="Compact"/>
+              <w:jc w:val="left"/>
+            </w:pPr>
+            <w:r>
+              <w:t xml:space="preserve">p</w:t>
+            </w:r>
+          </w:p>
+        </w:tc>
+        <w:tc>
+          <w:tcPr/>
+          <w:p>
+            <w:pPr>
+              <w:pStyle w:val="Compact"/>
+              <w:jc w:val="right"/>
+            </w:pPr>
+            <w:r>
+              <w:t xml:space="preserve">Mean diff (bpm)</w:t>
+            </w:r>
+          </w:p>
+        </w:tc>
+      </w:tr>
+      <w:tr>
+        <w:tc>
+          <w:tcPr/>
+          <w:p>
+            <w:pPr>
+              <w:pStyle w:val="Compact"/>
+              <w:jc w:val="left"/>
+            </w:pPr>
+            <w:r>
+              <w:t xml:space="preserve">Full available HAPPY sample</w:t>
+            </w:r>
+          </w:p>
+        </w:tc>
+        <w:tc>
+          <w:tcPr/>
+          <w:p>
+            <w:pPr>
+              <w:pStyle w:val="Compact"/>
+              <w:jc w:val="right"/>
+            </w:pPr>
+            <w:r>
+              <w:t xml:space="preserve">71</w:t>
+            </w:r>
+          </w:p>
+        </w:tc>
+        <w:tc>
+          <w:tcPr/>
+          <w:p>
+            <w:pPr>
+              <w:pStyle w:val="Compact"/>
+              <w:jc w:val="left"/>
+            </w:pPr>
+            <w:r>
+              <w:t xml:space="preserve">74.19 (8.95)</w:t>
+            </w:r>
+          </w:p>
+        </w:tc>
+        <w:tc>
+          <w:tcPr/>
+          <w:p>
+            <w:pPr>
+              <w:pStyle w:val="Compact"/>
+              <w:jc w:val="left"/>
+            </w:pPr>
+            <w:r>
+              <w:t xml:space="preserve">77.15 (9.58)</w:t>
+            </w:r>
+          </w:p>
+        </w:tc>
+        <w:tc>
+          <w:tcPr/>
+          <w:p>
+            <w:pPr>
+              <w:pStyle w:val="Compact"/>
+              <w:jc w:val="right"/>
+            </w:pPr>
+            <w:r>
+              <w:t xml:space="preserve">5.976</w:t>
+            </w:r>
+          </w:p>
+        </w:tc>
+        <w:tc>
+          <w:tcPr/>
+          <w:p>
+            <w:pPr>
+              <w:pStyle w:val="Compact"/>
+              <w:jc w:val="right"/>
+            </w:pPr>
+            <w:r>
+              <w:t xml:space="preserve">70</w:t>
+            </w:r>
+          </w:p>
+        </w:tc>
+        <w:tc>
+          <w:tcPr/>
+          <w:p>
+            <w:pPr>
+              <w:pStyle w:val="Compact"/>
+              <w:jc w:val="left"/>
+            </w:pPr>
+            <w:r>
+              <w:t xml:space="preserve">&lt; .001</w:t>
+            </w:r>
+          </w:p>
+        </w:tc>
+        <w:tc>
+          <w:tcPr/>
+          <w:p>
+            <w:pPr>
+              <w:pStyle w:val="Compact"/>
+              <w:jc w:val="right"/>
+            </w:pPr>
+            <w:r>
+              <w:t xml:space="preserve">2.959</w:t>
+            </w:r>
+          </w:p>
+        </w:tc>
+      </w:tr>
+      <w:tr>
+        <w:tc>
+          <w:tcPr/>
+          <w:p>
+            <w:pPr>
+              <w:pStyle w:val="Compact"/>
+              <w:jc w:val="left"/>
+            </w:pPr>
+            <w:r>
+              <w:t xml:space="preserve">Excluding any HAPPY-flagged runs</w:t>
+            </w:r>
+          </w:p>
+        </w:tc>
+        <w:tc>
+          <w:tcPr/>
+          <w:p>
+            <w:pPr>
+              <w:pStyle w:val="Compact"/>
+              <w:jc w:val="right"/>
+            </w:pPr>
+            <w:r>
+              <w:t xml:space="preserve">64</w:t>
+            </w:r>
+          </w:p>
+        </w:tc>
+        <w:tc>
+          <w:tcPr/>
+          <w:p>
+            <w:pPr>
+              <w:pStyle w:val="Compact"/>
+              <w:jc w:val="left"/>
+            </w:pPr>
+            <w:r>
+              <w:t xml:space="preserve">73.88 (7.44)</w:t>
+            </w:r>
+          </w:p>
+        </w:tc>
+        <w:tc>
+          <w:tcPr/>
+          <w:p>
+            <w:pPr>
+              <w:pStyle w:val="Compact"/>
+              <w:jc w:val="left"/>
+            </w:pPr>
+            <w:r>
+              <w:t xml:space="preserve">76.69 (8.32)</w:t>
+            </w:r>
+          </w:p>
+        </w:tc>
+        <w:tc>
+          <w:tcPr/>
+          <w:p>
+            <w:pPr>
+              <w:pStyle w:val="Compact"/>
+              <w:jc w:val="right"/>
+            </w:pPr>
+            <w:r>
+              <w:t xml:space="preserve">6.085</w:t>
+            </w:r>
+          </w:p>
+        </w:tc>
+        <w:tc>
+          <w:tcPr/>
+          <w:p>
+            <w:pPr>
+              <w:pStyle w:val="Compact"/>
+              <w:jc w:val="right"/>
+            </w:pPr>
+            <w:r>
+              <w:t xml:space="preserve">63</w:t>
+            </w:r>
+          </w:p>
+        </w:tc>
+        <w:tc>
+          <w:tcPr/>
+          <w:p>
+            <w:pPr>
+              <w:pStyle w:val="Compact"/>
+              <w:jc w:val="left"/>
+            </w:pPr>
+            <w:r>
+              <w:t xml:space="preserve">&lt; .001</w:t>
+            </w:r>
+          </w:p>
+        </w:tc>
+        <w:tc>
+          <w:tcPr/>
+          <w:p>
+            <w:pPr>
+              <w:pStyle w:val="Compact"/>
+              <w:jc w:val="right"/>
+            </w:pPr>
+            <w:r>
+              <w:t xml:space="preserve">2.806</w:t>
+            </w:r>
+          </w:p>
+        </w:tc>
+      </w:tr>
+    </w:tbl>
+    <w:p>
+      <w:pPr>
+        <w:pStyle w:val="BodyText"/>
+      </w:pPr>
+      <w:r>
+        <w:rPr>
+          <w:b/>
+          <w:bCs/>
+        </w:rPr>
+        <w:t xml:space="preserve">Results.</w:t>
+      </w:r>
+      <w:r>
+        <w:t xml:space="preserve"> </w:t>
+      </w:r>
+      <w:r>
+        <w:t xml:space="preserve">Using the full available HAPPY sample (N = 71) – substantially larger than the 50-person physio-only sample, since HAPPY recovers heart rate for most of the early participants who predate physio HR monitoring – task HR is significantly higher than resting HR (</w:t>
+      </w:r>
+      <w:r>
+        <w:rPr>
+          <w:i/>
+          <w:iCs/>
+        </w:rPr>
+        <w:t xml:space="preserve">p</w:t>
+      </w:r>
+      <w:r>
+        <w:t xml:space="preserve"> </w:t>
+      </w:r>
+      <w:r>
+        <w:t xml:space="preserve">&lt; .001; see table). The conclusion is unchanged whether HAPPY-flagged runs are excluded or not. One participant, TAG045, is a clear outlier on the task-minus-rest difference (+18.6 bpm, versus the next most extreme value of +9.3) and has only a single resting run plus one flagged run; excluding TAG045 specifically (rather than all flagged-run participants) gives</w:t>
+      </w:r>
+      <w:r>
+        <w:t xml:space="preserve"> </w:t>
+      </w:r>
+      <w:r>
+        <w:rPr>
+          <w:i/>
+          <w:iCs/>
+        </w:rPr>
+        <w:t xml:space="preserve">t</w:t>
+      </w:r>
+      <w:r>
+        <w:t xml:space="preserve">(69) = 6.1,</w:t>
+      </w:r>
+      <w:r>
+        <w:t xml:space="preserve"> </w:t>
+      </w:r>
+      <w:r>
+        <w:rPr>
+          <w:i/>
+          <w:iCs/>
+        </w:rPr>
+        <w:t xml:space="preserve">p</w:t>
+      </w:r>
+      <w:r>
+        <w:t xml:space="preserve"> </w:t>
+      </w:r>
+      <w:r>
+        <w:t xml:space="preserve">&lt; .001, mean diff = 2.74 bpm – the same conclusion either way.</w:t>
+      </w:r>
+    </w:p>
+    <w:p>
+      <w:pPr>
+        <w:pStyle w:val="BodyText"/>
+      </w:pPr>
+      <w:r>
+        <w:rPr>
+          <w:i/>
+          <w:iCs/>
+        </w:rPr>
+        <w:t xml:space="preserve">Note on scope.</w:t>
+      </w:r>
+      <w:r>
+        <w:t xml:space="preserve"> </w:t>
+      </w:r>
+      <w:r>
+        <w:t xml:space="preserve">HAPPY currently provides only overall resting and task heart rate, not the within-task condition breakdown (Self-Connected/Self-Disconnected/Other/Fixation-Cross); the within-task comparisons in Aim 1b have no HAPPY counterpart yet.</w:t>
+      </w:r>
+    </w:p>
+    <w:bookmarkEnd w:id="98"/>
+    <w:bookmarkEnd w:id="99"/>
+    <w:bookmarkStart w:id="102" w:name="cross-check"/>
+    <w:p>
+      <w:pPr>
+        <w:pStyle w:val="Heading2"/>
+      </w:pPr>
+      <w:r>
         <w:t xml:space="preserve">Cross-Check</w:t>
       </w:r>
     </w:p>
-    <w:bookmarkStart w:id="97" w:name="sensitivity-analysis-cross-check"/>
+    <w:bookmarkStart w:id="100" w:name="sensitivity-analysis-cross-check"/>
     <w:p>
       <w:pPr>
         <w:pStyle w:val="Heading3"/>
@@ -72682,8 +73603,8 @@
         <w:t xml:space="preserve">entries indicate the biomarker changed significance status across the sensitivity conditions. CRP was significant in the illness-excluded and bleed+smoke-excluded analyses but not in the primary analysis; i.e., its reactivity result was sensitive to which participants were included, not stable across all three samples.</w:t>
       </w:r>
     </w:p>
-    <w:bookmarkEnd w:id="97"/>
-    <w:bookmarkStart w:id="98" w:name="quadratic-time-trend-cross-check"/>
+    <w:bookmarkEnd w:id="100"/>
+    <w:bookmarkStart w:id="101" w:name="quadratic-time-trend-cross-check"/>
     <w:p>
       <w:pPr>
         <w:pStyle w:val="Heading3"/>
@@ -73509,9 +74430,9 @@
         <w:t xml:space="preserve">denominators differ by biomarker group.</w:t>
       </w:r>
     </w:p>
-    <w:bookmarkEnd w:id="98"/>
-    <w:bookmarkEnd w:id="99"/>
-    <w:bookmarkEnd w:id="100"/>
+    <w:bookmarkEnd w:id="101"/>
+    <w:bookmarkEnd w:id="102"/>
+    <w:bookmarkEnd w:id="103"/>
     <w:sectPr/>
   </w:body>
 </w:document>

</xml_diff>

<commit_message>
restructure and adding cond. specific happy hr analyses
</commit_message>
<xml_diff>
--- a/sos-bioreactivity-supplement.docx
+++ b/sos-bioreactivity-supplement.docx
@@ -41,7 +41,7 @@
         <w:pStyle w:val="Date"/>
       </w:pPr>
       <w:r>
-        <w:t xml:space="preserve">2026-10-14</w:t>
+        <w:t xml:space="preserve">2026-10-29</w:t>
       </w:r>
     </w:p>
     <w:sdt>
@@ -11732,7 +11732,7 @@
     </w:p>
     <w:bookmarkEnd w:id="38"/>
     <w:bookmarkEnd w:id="39"/>
-    <w:bookmarkStart w:id="103" w:name="sensitivity-analyses"/>
+    <w:bookmarkStart w:id="106" w:name="sensitivity-analyses"/>
     <w:p>
       <w:pPr>
         <w:pStyle w:val="Heading1"/>
@@ -71523,7 +71523,7 @@
     </w:p>
     <w:bookmarkEnd w:id="95"/>
     <w:bookmarkEnd w:id="96"/>
-    <w:bookmarkStart w:id="99" w:name="X07bdfa35ae1ff0bed89c84a838fcd3547699720"/>
+    <w:bookmarkStart w:id="102" w:name="X07bdfa35ae1ff0bed89c84a838fcd3547699720"/>
     <w:p>
       <w:pPr>
         <w:pStyle w:val="Heading2"/>
@@ -72424,27 +72424,1477 @@
         <w:t xml:space="preserve">&lt; .001, mean diff = 2.74 bpm – the same conclusion either way.</w:t>
       </w:r>
     </w:p>
+    <w:bookmarkEnd w:id="98"/>
+    <w:bookmarkStart w:id="101" w:name="Xa39e94b90cc4fbcf5cc3dcca03aa251fc4d241d"/>
+    <w:p>
+      <w:pPr>
+        <w:pStyle w:val="Heading3"/>
+      </w:pPr>
+      <w:r>
+        <w:t xml:space="preserve">Condition-Specific Heart Rate (Self-Connected, Self-Disconnected, Other, Fixation-Cross)</w:t>
+      </w:r>
+    </w:p>
+    <w:p>
+      <w:pPr>
+        <w:pStyle w:val="FirstParagraph"/>
+      </w:pPr>
+      <w:r>
+        <w:t xml:space="preserve">HAPPY now also provides condition-specific heart rate within the task run (from the BIDS events files built for this purpose; see</w:t>
+      </w:r>
+      <w:r>
+        <w:t xml:space="preserve"> </w:t>
+      </w:r>
+      <w:r>
+        <w:rPr>
+          <w:rStyle w:val="VerbatimChar"/>
+        </w:rPr>
+        <w:t xml:space="preserve">code/make_sos_events.py</w:t>
+      </w:r>
+      <w:r>
+        <w:t xml:space="preserve">), so the within-task comparisons from Aim 1b (Self-Connected vs. Self-Disconnected/Other/Fixation-Cross) can be checked and replicated the same way as the task-vs-rest comparison above.</w:t>
+      </w:r>
+    </w:p>
+    <w:bookmarkStart w:id="99" w:name="Xa4c5577687784fc97a630b850642b75f02cb7c0"/>
+    <w:p>
+      <w:pPr>
+        <w:pStyle w:val="Heading4"/>
+      </w:pPr>
+      <w:r>
+        <w:t xml:space="preserve">Reliability: Original vs. HAPPY, by Condition</w:t>
+      </w:r>
+    </w:p>
+    <w:p>
+      <w:pPr>
+        <w:pStyle w:val="TableCaption"/>
+      </w:pPr>
+      <w:r>
+        <w:t xml:space="preserve">Agreement between original (physio) and HAPPY heart rate, by within-task condition</w:t>
+      </w:r>
+    </w:p>
+    <w:tbl>
+      <w:tblPr>
+        <w:tblStyle w:val="Table"/>
+        <w:tblW w:type="pct" w:w="5000"/>
+        <w:tblLayout w:type="fixed"/>
+        <w:tblLook w:firstRow="1" w:lastRow="0" w:firstColumn="0" w:lastColumn="0" w:noHBand="0" w:noVBand="0" w:val="0020"/>
+        <w:tblCaption w:val="Agreement between original (physio) and HAPPY heart rate, by within-task condition"/>
+      </w:tblPr>
+      <w:tblGrid>
+        <w:gridCol w:w="2431"/>
+        <w:gridCol w:w="208"/>
+        <w:gridCol w:w="416"/>
+        <w:gridCol w:w="416"/>
+        <w:gridCol w:w="1042"/>
+        <w:gridCol w:w="2014"/>
+        <w:gridCol w:w="1389"/>
+      </w:tblGrid>
+      <w:tr>
+        <w:trPr>
+          <w:tblHeader w:val="on"/>
+        </w:trPr>
+        <w:tc>
+          <w:tcPr/>
+          <w:p>
+            <w:pPr>
+              <w:pStyle w:val="Compact"/>
+              <w:jc w:val="left"/>
+            </w:pPr>
+            <w:r>
+              <w:t xml:space="preserve">Measure</w:t>
+            </w:r>
+          </w:p>
+        </w:tc>
+        <w:tc>
+          <w:tcPr/>
+          <w:p>
+            <w:pPr>
+              <w:pStyle w:val="Compact"/>
+              <w:jc w:val="right"/>
+            </w:pPr>
+            <w:r>
+              <w:t xml:space="preserve">n</w:t>
+            </w:r>
+          </w:p>
+        </w:tc>
+        <w:tc>
+          <w:tcPr/>
+          <w:p>
+            <w:pPr>
+              <w:pStyle w:val="Compact"/>
+              <w:jc w:val="right"/>
+            </w:pPr>
+            <w:r>
+              <w:t xml:space="preserve">r</w:t>
+            </w:r>
+          </w:p>
+        </w:tc>
+        <w:tc>
+          <w:tcPr/>
+          <w:p>
+            <w:pPr>
+              <w:pStyle w:val="Compact"/>
+              <w:jc w:val="right"/>
+            </w:pPr>
+            <w:r>
+              <w:t xml:space="preserve">ICC</w:t>
+            </w:r>
+          </w:p>
+        </w:tc>
+        <w:tc>
+          <w:tcPr/>
+          <w:p>
+            <w:pPr>
+              <w:pStyle w:val="Compact"/>
+              <w:jc w:val="left"/>
+            </w:pPr>
+            <w:r>
+              <w:t xml:space="preserve">ICC 95% CI</w:t>
+            </w:r>
+          </w:p>
+        </w:tc>
+        <w:tc>
+          <w:tcPr/>
+          <w:p>
+            <w:pPr>
+              <w:pStyle w:val="Compact"/>
+              <w:jc w:val="right"/>
+            </w:pPr>
+            <w:r>
+              <w:t xml:space="preserve">Mean bias (HAPPY - original)</w:t>
+            </w:r>
+          </w:p>
+        </w:tc>
+        <w:tc>
+          <w:tcPr/>
+          <w:p>
+            <w:pPr>
+              <w:pStyle w:val="Compact"/>
+              <w:jc w:val="left"/>
+            </w:pPr>
+            <w:r>
+              <w:t xml:space="preserve">Limits of agreement</w:t>
+            </w:r>
+          </w:p>
+        </w:tc>
+      </w:tr>
+      <w:tr>
+        <w:tc>
+          <w:tcPr/>
+          <w:p>
+            <w:pPr>
+              <w:pStyle w:val="Compact"/>
+              <w:jc w:val="left"/>
+            </w:pPr>
+            <w:r>
+              <w:t xml:space="preserve">Self-Connected</w:t>
+            </w:r>
+          </w:p>
+        </w:tc>
+        <w:tc>
+          <w:tcPr/>
+          <w:p>
+            <w:pPr>
+              <w:pStyle w:val="Compact"/>
+              <w:jc w:val="right"/>
+            </w:pPr>
+            <w:r>
+              <w:t xml:space="preserve">49</w:t>
+            </w:r>
+          </w:p>
+        </w:tc>
+        <w:tc>
+          <w:tcPr/>
+          <w:p>
+            <w:pPr>
+              <w:pStyle w:val="Compact"/>
+              <w:jc w:val="right"/>
+            </w:pPr>
+            <w:r>
+              <w:t xml:space="preserve">0.990</w:t>
+            </w:r>
+          </w:p>
+        </w:tc>
+        <w:tc>
+          <w:tcPr/>
+          <w:p>
+            <w:pPr>
+              <w:pStyle w:val="Compact"/>
+              <w:jc w:val="right"/>
+            </w:pPr>
+            <w:r>
+              <w:t xml:space="preserve">0.990</w:t>
+            </w:r>
+          </w:p>
+        </w:tc>
+        <w:tc>
+          <w:tcPr/>
+          <w:p>
+            <w:pPr>
+              <w:pStyle w:val="Compact"/>
+              <w:jc w:val="left"/>
+            </w:pPr>
+            <w:r>
+              <w:t xml:space="preserve">[0.982, 0.994]</w:t>
+            </w:r>
+          </w:p>
+        </w:tc>
+        <w:tc>
+          <w:tcPr/>
+          <w:p>
+            <w:pPr>
+              <w:pStyle w:val="Compact"/>
+              <w:jc w:val="right"/>
+            </w:pPr>
+            <w:r>
+              <w:t xml:space="preserve">-0.23</w:t>
+            </w:r>
+          </w:p>
+        </w:tc>
+        <w:tc>
+          <w:tcPr/>
+          <w:p>
+            <w:pPr>
+              <w:pStyle w:val="Compact"/>
+              <w:jc w:val="left"/>
+            </w:pPr>
+            <w:r>
+              <w:t xml:space="preserve">[-2.89, 2.43]</w:t>
+            </w:r>
+          </w:p>
+        </w:tc>
+      </w:tr>
+      <w:tr>
+        <w:tc>
+          <w:tcPr/>
+          <w:p>
+            <w:pPr>
+              <w:pStyle w:val="Compact"/>
+              <w:jc w:val="left"/>
+            </w:pPr>
+            <w:r>
+              <w:t xml:space="preserve">Self-Disconnected</w:t>
+            </w:r>
+          </w:p>
+        </w:tc>
+        <w:tc>
+          <w:tcPr/>
+          <w:p>
+            <w:pPr>
+              <w:pStyle w:val="Compact"/>
+              <w:jc w:val="right"/>
+            </w:pPr>
+            <w:r>
+              <w:t xml:space="preserve">49</w:t>
+            </w:r>
+          </w:p>
+        </w:tc>
+        <w:tc>
+          <w:tcPr/>
+          <w:p>
+            <w:pPr>
+              <w:pStyle w:val="Compact"/>
+              <w:jc w:val="right"/>
+            </w:pPr>
+            <w:r>
+              <w:t xml:space="preserve">0.994</w:t>
+            </w:r>
+          </w:p>
+        </w:tc>
+        <w:tc>
+          <w:tcPr/>
+          <w:p>
+            <w:pPr>
+              <w:pStyle w:val="Compact"/>
+              <w:jc w:val="right"/>
+            </w:pPr>
+            <w:r>
+              <w:t xml:space="preserve">0.994</w:t>
+            </w:r>
+          </w:p>
+        </w:tc>
+        <w:tc>
+          <w:tcPr/>
+          <w:p>
+            <w:pPr>
+              <w:pStyle w:val="Compact"/>
+              <w:jc w:val="left"/>
+            </w:pPr>
+            <w:r>
+              <w:t xml:space="preserve">[0.99, 0.997]</w:t>
+            </w:r>
+          </w:p>
+        </w:tc>
+        <w:tc>
+          <w:tcPr/>
+          <w:p>
+            <w:pPr>
+              <w:pStyle w:val="Compact"/>
+              <w:jc w:val="right"/>
+            </w:pPr>
+            <w:r>
+              <w:t xml:space="preserve">-0.12</w:t>
+            </w:r>
+          </w:p>
+        </w:tc>
+        <w:tc>
+          <w:tcPr/>
+          <w:p>
+            <w:pPr>
+              <w:pStyle w:val="Compact"/>
+              <w:jc w:val="left"/>
+            </w:pPr>
+            <w:r>
+              <w:t xml:space="preserve">[-2.12, 1.89]</w:t>
+            </w:r>
+          </w:p>
+        </w:tc>
+      </w:tr>
+      <w:tr>
+        <w:tc>
+          <w:tcPr/>
+          <w:p>
+            <w:pPr>
+              <w:pStyle w:val="Compact"/>
+              <w:jc w:val="left"/>
+            </w:pPr>
+            <w:r>
+              <w:t xml:space="preserve">Other</w:t>
+            </w:r>
+          </w:p>
+        </w:tc>
+        <w:tc>
+          <w:tcPr/>
+          <w:p>
+            <w:pPr>
+              <w:pStyle w:val="Compact"/>
+              <w:jc w:val="right"/>
+            </w:pPr>
+            <w:r>
+              <w:t xml:space="preserve">49</w:t>
+            </w:r>
+          </w:p>
+        </w:tc>
+        <w:tc>
+          <w:tcPr/>
+          <w:p>
+            <w:pPr>
+              <w:pStyle w:val="Compact"/>
+              <w:jc w:val="right"/>
+            </w:pPr>
+            <w:r>
+              <w:t xml:space="preserve">0.994</w:t>
+            </w:r>
+          </w:p>
+        </w:tc>
+        <w:tc>
+          <w:tcPr/>
+          <w:p>
+            <w:pPr>
+              <w:pStyle w:val="Compact"/>
+              <w:jc w:val="right"/>
+            </w:pPr>
+            <w:r>
+              <w:t xml:space="preserve">0.994</w:t>
+            </w:r>
+          </w:p>
+        </w:tc>
+        <w:tc>
+          <w:tcPr/>
+          <w:p>
+            <w:pPr>
+              <w:pStyle w:val="Compact"/>
+              <w:jc w:val="left"/>
+            </w:pPr>
+            <w:r>
+              <w:t xml:space="preserve">[0.989, 0.996]</w:t>
+            </w:r>
+          </w:p>
+        </w:tc>
+        <w:tc>
+          <w:tcPr/>
+          <w:p>
+            <w:pPr>
+              <w:pStyle w:val="Compact"/>
+              <w:jc w:val="right"/>
+            </w:pPr>
+            <w:r>
+              <w:t xml:space="preserve">-0.11</w:t>
+            </w:r>
+          </w:p>
+        </w:tc>
+        <w:tc>
+          <w:tcPr/>
+          <w:p>
+            <w:pPr>
+              <w:pStyle w:val="Compact"/>
+              <w:jc w:val="left"/>
+            </w:pPr>
+            <w:r>
+              <w:t xml:space="preserve">[-2.22, 2]</w:t>
+            </w:r>
+          </w:p>
+        </w:tc>
+      </w:tr>
+      <w:tr>
+        <w:tc>
+          <w:tcPr/>
+          <w:p>
+            <w:pPr>
+              <w:pStyle w:val="Compact"/>
+              <w:jc w:val="left"/>
+            </w:pPr>
+            <w:r>
+              <w:t xml:space="preserve">Fixation-Cross</w:t>
+            </w:r>
+          </w:p>
+        </w:tc>
+        <w:tc>
+          <w:tcPr/>
+          <w:p>
+            <w:pPr>
+              <w:pStyle w:val="Compact"/>
+              <w:jc w:val="right"/>
+            </w:pPr>
+            <w:r>
+              <w:t xml:space="preserve">49</w:t>
+            </w:r>
+          </w:p>
+        </w:tc>
+        <w:tc>
+          <w:tcPr/>
+          <w:p>
+            <w:pPr>
+              <w:pStyle w:val="Compact"/>
+              <w:jc w:val="right"/>
+            </w:pPr>
+            <w:r>
+              <w:t xml:space="preserve">0.994</w:t>
+            </w:r>
+          </w:p>
+        </w:tc>
+        <w:tc>
+          <w:tcPr/>
+          <w:p>
+            <w:pPr>
+              <w:pStyle w:val="Compact"/>
+              <w:jc w:val="right"/>
+            </w:pPr>
+            <w:r>
+              <w:t xml:space="preserve">0.993</w:t>
+            </w:r>
+          </w:p>
+        </w:tc>
+        <w:tc>
+          <w:tcPr/>
+          <w:p>
+            <w:pPr>
+              <w:pStyle w:val="Compact"/>
+              <w:jc w:val="left"/>
+            </w:pPr>
+            <w:r>
+              <w:t xml:space="preserve">[0.988, 0.996]</w:t>
+            </w:r>
+          </w:p>
+        </w:tc>
+        <w:tc>
+          <w:tcPr/>
+          <w:p>
+            <w:pPr>
+              <w:pStyle w:val="Compact"/>
+              <w:jc w:val="right"/>
+            </w:pPr>
+            <w:r>
+              <w:t xml:space="preserve">-0.17</w:t>
+            </w:r>
+          </w:p>
+        </w:tc>
+        <w:tc>
+          <w:tcPr/>
+          <w:p>
+            <w:pPr>
+              <w:pStyle w:val="Compact"/>
+              <w:jc w:val="left"/>
+            </w:pPr>
+            <w:r>
+              <w:t xml:space="preserve">[-2.21, 1.88]</w:t>
+            </w:r>
+          </w:p>
+        </w:tc>
+      </w:tr>
+      <w:tr>
+        <w:tc>
+          <w:tcPr/>
+          <w:p>
+            <w:pPr>
+              <w:pStyle w:val="Compact"/>
+              <w:jc w:val="left"/>
+            </w:pPr>
+            <w:r>
+              <w:t xml:space="preserve">Self-Connected − Self-Disconnected</w:t>
+            </w:r>
+          </w:p>
+        </w:tc>
+        <w:tc>
+          <w:tcPr/>
+          <w:p>
+            <w:pPr>
+              <w:pStyle w:val="Compact"/>
+              <w:jc w:val="right"/>
+            </w:pPr>
+            <w:r>
+              <w:t xml:space="preserve">49</w:t>
+            </w:r>
+          </w:p>
+        </w:tc>
+        <w:tc>
+          <w:tcPr/>
+          <w:p>
+            <w:pPr>
+              <w:pStyle w:val="Compact"/>
+              <w:jc w:val="right"/>
+            </w:pPr>
+            <w:r>
+              <w:t xml:space="preserve">0.545</w:t>
+            </w:r>
+          </w:p>
+        </w:tc>
+        <w:tc>
+          <w:tcPr/>
+          <w:p>
+            <w:pPr>
+              <w:pStyle w:val="Compact"/>
+              <w:jc w:val="right"/>
+            </w:pPr>
+            <w:r>
+              <w:t xml:space="preserve">0.533</w:t>
+            </w:r>
+          </w:p>
+        </w:tc>
+        <w:tc>
+          <w:tcPr/>
+          <w:p>
+            <w:pPr>
+              <w:pStyle w:val="Compact"/>
+              <w:jc w:val="left"/>
+            </w:pPr>
+            <w:r>
+              <w:t xml:space="preserve">[0.301, 0.707]</w:t>
+            </w:r>
+          </w:p>
+        </w:tc>
+        <w:tc>
+          <w:tcPr/>
+          <w:p>
+            <w:pPr>
+              <w:pStyle w:val="Compact"/>
+              <w:jc w:val="right"/>
+            </w:pPr>
+            <w:r>
+              <w:t xml:space="preserve">-0.11</w:t>
+            </w:r>
+          </w:p>
+        </w:tc>
+        <w:tc>
+          <w:tcPr/>
+          <w:p>
+            <w:pPr>
+              <w:pStyle w:val="Compact"/>
+              <w:jc w:val="left"/>
+            </w:pPr>
+            <w:r>
+              <w:t xml:space="preserve">[-2.79, 2.56]</w:t>
+            </w:r>
+          </w:p>
+        </w:tc>
+      </w:tr>
+      <w:tr>
+        <w:tc>
+          <w:tcPr/>
+          <w:p>
+            <w:pPr>
+              <w:pStyle w:val="Compact"/>
+              <w:jc w:val="left"/>
+            </w:pPr>
+            <w:r>
+              <w:t xml:space="preserve">Self-Connected − Other</w:t>
+            </w:r>
+          </w:p>
+        </w:tc>
+        <w:tc>
+          <w:tcPr/>
+          <w:p>
+            <w:pPr>
+              <w:pStyle w:val="Compact"/>
+              <w:jc w:val="right"/>
+            </w:pPr>
+            <w:r>
+              <w:t xml:space="preserve">49</w:t>
+            </w:r>
+          </w:p>
+        </w:tc>
+        <w:tc>
+          <w:tcPr/>
+          <w:p>
+            <w:pPr>
+              <w:pStyle w:val="Compact"/>
+              <w:jc w:val="right"/>
+            </w:pPr>
+            <w:r>
+              <w:t xml:space="preserve">0.794</w:t>
+            </w:r>
+          </w:p>
+        </w:tc>
+        <w:tc>
+          <w:tcPr/>
+          <w:p>
+            <w:pPr>
+              <w:pStyle w:val="Compact"/>
+              <w:jc w:val="right"/>
+            </w:pPr>
+            <w:r>
+              <w:t xml:space="preserve">0.779</w:t>
+            </w:r>
+          </w:p>
+        </w:tc>
+        <w:tc>
+          <w:tcPr/>
+          <w:p>
+            <w:pPr>
+              <w:pStyle w:val="Compact"/>
+              <w:jc w:val="left"/>
+            </w:pPr>
+            <w:r>
+              <w:t xml:space="preserve">[0.64, 0.869]</w:t>
+            </w:r>
+          </w:p>
+        </w:tc>
+        <w:tc>
+          <w:tcPr/>
+          <w:p>
+            <w:pPr>
+              <w:pStyle w:val="Compact"/>
+              <w:jc w:val="right"/>
+            </w:pPr>
+            <w:r>
+              <w:t xml:space="preserve">-0.12</w:t>
+            </w:r>
+          </w:p>
+        </w:tc>
+        <w:tc>
+          <w:tcPr/>
+          <w:p>
+            <w:pPr>
+              <w:pStyle w:val="Compact"/>
+              <w:jc w:val="left"/>
+            </w:pPr>
+            <w:r>
+              <w:t xml:space="preserve">[-2.2, 1.96]</w:t>
+            </w:r>
+          </w:p>
+        </w:tc>
+      </w:tr>
+      <w:tr>
+        <w:tc>
+          <w:tcPr/>
+          <w:p>
+            <w:pPr>
+              <w:pStyle w:val="Compact"/>
+              <w:jc w:val="left"/>
+            </w:pPr>
+            <w:r>
+              <w:t xml:space="preserve">Self-Connected − Fixation-Cross</w:t>
+            </w:r>
+          </w:p>
+        </w:tc>
+        <w:tc>
+          <w:tcPr/>
+          <w:p>
+            <w:pPr>
+              <w:pStyle w:val="Compact"/>
+              <w:jc w:val="right"/>
+            </w:pPr>
+            <w:r>
+              <w:t xml:space="preserve">49</w:t>
+            </w:r>
+          </w:p>
+        </w:tc>
+        <w:tc>
+          <w:tcPr/>
+          <w:p>
+            <w:pPr>
+              <w:pStyle w:val="Compact"/>
+              <w:jc w:val="right"/>
+            </w:pPr>
+            <w:r>
+              <w:t xml:space="preserve">0.762</w:t>
+            </w:r>
+          </w:p>
+        </w:tc>
+        <w:tc>
+          <w:tcPr/>
+          <w:p>
+            <w:pPr>
+              <w:pStyle w:val="Compact"/>
+              <w:jc w:val="right"/>
+            </w:pPr>
+            <w:r>
+              <w:t xml:space="preserve">0.766</w:t>
+            </w:r>
+          </w:p>
+        </w:tc>
+        <w:tc>
+          <w:tcPr/>
+          <w:p>
+            <w:pPr>
+              <w:pStyle w:val="Compact"/>
+              <w:jc w:val="left"/>
+            </w:pPr>
+            <w:r>
+              <w:t xml:space="preserve">[0.62, 0.86]</w:t>
+            </w:r>
+          </w:p>
+        </w:tc>
+        <w:tc>
+          <w:tcPr/>
+          <w:p>
+            <w:pPr>
+              <w:pStyle w:val="Compact"/>
+              <w:jc w:val="right"/>
+            </w:pPr>
+            <w:r>
+              <w:t xml:space="preserve">-0.06</w:t>
+            </w:r>
+          </w:p>
+        </w:tc>
+        <w:tc>
+          <w:tcPr/>
+          <w:p>
+            <w:pPr>
+              <w:pStyle w:val="Compact"/>
+              <w:jc w:val="left"/>
+            </w:pPr>
+            <w:r>
+              <w:t xml:space="preserve">[-1.95, 1.82]</w:t>
+            </w:r>
+          </w:p>
+        </w:tc>
+      </w:tr>
+    </w:tbl>
     <w:p>
       <w:pPr>
         <w:pStyle w:val="BodyText"/>
       </w:pPr>
       <w:r>
         <w:rPr>
+          <w:b/>
+          <w:bCs/>
+        </w:rPr>
+        <w:t xml:space="preserve">Results.</w:t>
+      </w:r>
+      <w:r>
+        <w:t xml:space="preserve"> </w:t>
+      </w:r>
+      <w:r>
+        <w:t xml:space="preserve">Of the 76-person biomarker sample, 49 have condition-specific heart rate from both methods. Agreement for the four raw condition means is excellent (ICC range: 0.99-0.994). Agreement for the three within-task difference scores is lower, as expected for differenced measures with a small true effect size, but still acceptable-to-good (ICC range: 0.533-0.779).</w:t>
+      </w:r>
+    </w:p>
+    <w:bookmarkEnd w:id="99"/>
+    <w:bookmarkStart w:id="100" w:name="Xf1391640e1a57512b3b67735af73717c9f17fce"/>
+    <w:p>
+      <w:pPr>
+        <w:pStyle w:val="Heading4"/>
+      </w:pPr>
+      <w:r>
+        <w:t xml:space="preserve">Within-Task Comparisons Using the Full HAPPY Sample</w:t>
+      </w:r>
+    </w:p>
+    <w:p>
+      <w:pPr>
+        <w:pStyle w:val="TableCaption"/>
+      </w:pPr>
+      <w:r>
+        <w:t xml:space="preserve">Within-task heart rate comparisons using the full HAPPY sample</w:t>
+      </w:r>
+    </w:p>
+    <w:tbl>
+      <w:tblPr>
+        <w:tblStyle w:val="Table"/>
+        <w:tblW w:type="pct" w:w="5000"/>
+        <w:tblLayout w:type="fixed"/>
+        <w:tblLook w:firstRow="1" w:lastRow="0" w:firstColumn="0" w:lastColumn="0" w:noHBand="0" w:noVBand="0" w:val="0020"/>
+        <w:tblCaption w:val="Within-task heart rate comparisons using the full HAPPY sample"/>
+      </w:tblPr>
+      <w:tblGrid>
+        <w:gridCol w:w="2489"/>
+        <w:gridCol w:w="2790"/>
+        <w:gridCol w:w="226"/>
+        <w:gridCol w:w="452"/>
+        <w:gridCol w:w="226"/>
+        <w:gridCol w:w="528"/>
+        <w:gridCol w:w="1206"/>
+      </w:tblGrid>
+      <w:tr>
+        <w:trPr>
+          <w:tblHeader w:val="on"/>
+        </w:trPr>
+        <w:tc>
+          <w:tcPr/>
+          <w:p>
+            <w:pPr>
+              <w:pStyle w:val="Compact"/>
+              <w:jc w:val="left"/>
+            </w:pPr>
+            <w:r>
+              <w:t xml:space="preserve">Sample</w:t>
+            </w:r>
+          </w:p>
+        </w:tc>
+        <w:tc>
+          <w:tcPr/>
+          <w:p>
+            <w:pPr>
+              <w:pStyle w:val="Compact"/>
+              <w:jc w:val="left"/>
+            </w:pPr>
+            <w:r>
+              <w:t xml:space="preserve">Comparison</w:t>
+            </w:r>
+          </w:p>
+        </w:tc>
+        <w:tc>
+          <w:tcPr/>
+          <w:p>
+            <w:pPr>
+              <w:pStyle w:val="Compact"/>
+              <w:jc w:val="right"/>
+            </w:pPr>
+            <w:r>
+              <w:t xml:space="preserve">n</w:t>
+            </w:r>
+          </w:p>
+        </w:tc>
+        <w:tc>
+          <w:tcPr/>
+          <w:p>
+            <w:pPr>
+              <w:pStyle w:val="Compact"/>
+              <w:jc w:val="right"/>
+            </w:pPr>
+            <w:r>
+              <w:t xml:space="preserve">t</w:t>
+            </w:r>
+          </w:p>
+        </w:tc>
+        <w:tc>
+          <w:tcPr/>
+          <w:p>
+            <w:pPr>
+              <w:pStyle w:val="Compact"/>
+              <w:jc w:val="right"/>
+            </w:pPr>
+            <w:r>
+              <w:t xml:space="preserve">df</w:t>
+            </w:r>
+          </w:p>
+        </w:tc>
+        <w:tc>
+          <w:tcPr/>
+          <w:p>
+            <w:pPr>
+              <w:pStyle w:val="Compact"/>
+              <w:jc w:val="left"/>
+            </w:pPr>
+            <w:r>
+              <w:t xml:space="preserve">p</w:t>
+            </w:r>
+          </w:p>
+        </w:tc>
+        <w:tc>
+          <w:tcPr/>
+          <w:p>
+            <w:pPr>
+              <w:pStyle w:val="Compact"/>
+              <w:jc w:val="right"/>
+            </w:pPr>
+            <w:r>
+              <w:t xml:space="preserve">Mean diff (bpm)</w:t>
+            </w:r>
+          </w:p>
+        </w:tc>
+      </w:tr>
+      <w:tr>
+        <w:tc>
+          <w:tcPr/>
+          <w:p>
+            <w:pPr>
+              <w:pStyle w:val="Compact"/>
+              <w:jc w:val="left"/>
+            </w:pPr>
+            <w:r>
+              <w:t xml:space="preserve">Full available HAPPY sample</w:t>
+            </w:r>
+          </w:p>
+        </w:tc>
+        <w:tc>
+          <w:tcPr/>
+          <w:p>
+            <w:pPr>
+              <w:pStyle w:val="Compact"/>
+              <w:jc w:val="left"/>
+            </w:pPr>
+            <w:r>
+              <w:t xml:space="preserve">Self-Connected vs. Self-Disconnected</w:t>
+            </w:r>
+          </w:p>
+        </w:tc>
+        <w:tc>
+          <w:tcPr/>
+          <w:p>
+            <w:pPr>
+              <w:pStyle w:val="Compact"/>
+              <w:jc w:val="right"/>
+            </w:pPr>
+            <w:r>
+              <w:t xml:space="preserve">73</w:t>
+            </w:r>
+          </w:p>
+        </w:tc>
+        <w:tc>
+          <w:tcPr/>
+          <w:p>
+            <w:pPr>
+              <w:pStyle w:val="Compact"/>
+              <w:jc w:val="right"/>
+            </w:pPr>
+            <w:r>
+              <w:t xml:space="preserve">1.931</w:t>
+            </w:r>
+          </w:p>
+        </w:tc>
+        <w:tc>
+          <w:tcPr/>
+          <w:p>
+            <w:pPr>
+              <w:pStyle w:val="Compact"/>
+              <w:jc w:val="right"/>
+            </w:pPr>
+            <w:r>
+              <w:t xml:space="preserve">72</w:t>
+            </w:r>
+          </w:p>
+        </w:tc>
+        <w:tc>
+          <w:tcPr/>
+          <w:p>
+            <w:pPr>
+              <w:pStyle w:val="Compact"/>
+              <w:jc w:val="left"/>
+            </w:pPr>
+            <w:r>
+              <w:t xml:space="preserve">0.0574</w:t>
+            </w:r>
+          </w:p>
+        </w:tc>
+        <w:tc>
+          <w:tcPr/>
+          <w:p>
+            <w:pPr>
+              <w:pStyle w:val="Compact"/>
+              <w:jc w:val="right"/>
+            </w:pPr>
+            <w:r>
+              <w:t xml:space="preserve">0.384</w:t>
+            </w:r>
+          </w:p>
+        </w:tc>
+      </w:tr>
+      <w:tr>
+        <w:tc>
+          <w:tcPr/>
+          <w:p>
+            <w:pPr>
+              <w:pStyle w:val="Compact"/>
+              <w:jc w:val="left"/>
+            </w:pPr>
+            <w:r>
+              <w:t xml:space="preserve">Full available HAPPY sample</w:t>
+            </w:r>
+          </w:p>
+        </w:tc>
+        <w:tc>
+          <w:tcPr/>
+          <w:p>
+            <w:pPr>
+              <w:pStyle w:val="Compact"/>
+              <w:jc w:val="left"/>
+            </w:pPr>
+            <w:r>
+              <w:t xml:space="preserve">Self-Connected vs. Other</w:t>
+            </w:r>
+          </w:p>
+        </w:tc>
+        <w:tc>
+          <w:tcPr/>
+          <w:p>
+            <w:pPr>
+              <w:pStyle w:val="Compact"/>
+              <w:jc w:val="right"/>
+            </w:pPr>
+            <w:r>
+              <w:t xml:space="preserve">73</w:t>
+            </w:r>
+          </w:p>
+        </w:tc>
+        <w:tc>
+          <w:tcPr/>
+          <w:p>
+            <w:pPr>
+              <w:pStyle w:val="Compact"/>
+              <w:jc w:val="right"/>
+            </w:pPr>
+            <w:r>
+              <w:t xml:space="preserve">6.643</w:t>
+            </w:r>
+          </w:p>
+        </w:tc>
+        <w:tc>
+          <w:tcPr/>
+          <w:p>
+            <w:pPr>
+              <w:pStyle w:val="Compact"/>
+              <w:jc w:val="right"/>
+            </w:pPr>
+            <w:r>
+              <w:t xml:space="preserve">72</w:t>
+            </w:r>
+          </w:p>
+        </w:tc>
+        <w:tc>
+          <w:tcPr/>
+          <w:p>
+            <w:pPr>
+              <w:pStyle w:val="Compact"/>
+              <w:jc w:val="left"/>
+            </w:pPr>
+            <w:r>
+              <w:t xml:space="preserve">&lt; .001</w:t>
+            </w:r>
+          </w:p>
+        </w:tc>
+        <w:tc>
+          <w:tcPr/>
+          <w:p>
+            <w:pPr>
+              <w:pStyle w:val="Compact"/>
+              <w:jc w:val="right"/>
+            </w:pPr>
+            <w:r>
+              <w:t xml:space="preserve">1.252</w:t>
+            </w:r>
+          </w:p>
+        </w:tc>
+      </w:tr>
+      <w:tr>
+        <w:tc>
+          <w:tcPr/>
+          <w:p>
+            <w:pPr>
+              <w:pStyle w:val="Compact"/>
+              <w:jc w:val="left"/>
+            </w:pPr>
+            <w:r>
+              <w:t xml:space="preserve">Full available HAPPY sample</w:t>
+            </w:r>
+          </w:p>
+        </w:tc>
+        <w:tc>
+          <w:tcPr/>
+          <w:p>
+            <w:pPr>
+              <w:pStyle w:val="Compact"/>
+              <w:jc w:val="left"/>
+            </w:pPr>
+            <w:r>
+              <w:t xml:space="preserve">Self-Connected vs. Fixation-Cross</w:t>
+            </w:r>
+          </w:p>
+        </w:tc>
+        <w:tc>
+          <w:tcPr/>
+          <w:p>
+            <w:pPr>
+              <w:pStyle w:val="Compact"/>
+              <w:jc w:val="right"/>
+            </w:pPr>
+            <w:r>
+              <w:t xml:space="preserve">73</w:t>
+            </w:r>
+          </w:p>
+        </w:tc>
+        <w:tc>
+          <w:tcPr/>
+          <w:p>
+            <w:pPr>
+              <w:pStyle w:val="Compact"/>
+              <w:jc w:val="right"/>
+            </w:pPr>
+            <w:r>
+              <w:t xml:space="preserve">2.986</w:t>
+            </w:r>
+          </w:p>
+        </w:tc>
+        <w:tc>
+          <w:tcPr/>
+          <w:p>
+            <w:pPr>
+              <w:pStyle w:val="Compact"/>
+              <w:jc w:val="right"/>
+            </w:pPr>
+            <w:r>
+              <w:t xml:space="preserve">72</w:t>
+            </w:r>
+          </w:p>
+        </w:tc>
+        <w:tc>
+          <w:tcPr/>
+          <w:p>
+            <w:pPr>
+              <w:pStyle w:val="Compact"/>
+              <w:jc w:val="left"/>
+            </w:pPr>
+            <w:r>
+              <w:t xml:space="preserve">0.0039</w:t>
+            </w:r>
+          </w:p>
+        </w:tc>
+        <w:tc>
+          <w:tcPr/>
+          <w:p>
+            <w:pPr>
+              <w:pStyle w:val="Compact"/>
+              <w:jc w:val="right"/>
+            </w:pPr>
+            <w:r>
+              <w:t xml:space="preserve">0.551</w:t>
+            </w:r>
+          </w:p>
+        </w:tc>
+      </w:tr>
+      <w:tr>
+        <w:tc>
+          <w:tcPr/>
+          <w:p>
+            <w:pPr>
+              <w:pStyle w:val="Compact"/>
+              <w:jc w:val="left"/>
+            </w:pPr>
+            <w:r>
+              <w:t xml:space="preserve">Excluding any HAPPY-flagged runs</w:t>
+            </w:r>
+          </w:p>
+        </w:tc>
+        <w:tc>
+          <w:tcPr/>
+          <w:p>
+            <w:pPr>
+              <w:pStyle w:val="Compact"/>
+              <w:jc w:val="left"/>
+            </w:pPr>
+            <w:r>
+              <w:t xml:space="preserve">Self-Connected vs. Self-Disconnected</w:t>
+            </w:r>
+          </w:p>
+        </w:tc>
+        <w:tc>
+          <w:tcPr/>
+          <w:p>
+            <w:pPr>
+              <w:pStyle w:val="Compact"/>
+              <w:jc w:val="right"/>
+            </w:pPr>
+            <w:r>
+              <w:t xml:space="preserve">69</w:t>
+            </w:r>
+          </w:p>
+        </w:tc>
+        <w:tc>
+          <w:tcPr/>
+          <w:p>
+            <w:pPr>
+              <w:pStyle w:val="Compact"/>
+              <w:jc w:val="right"/>
+            </w:pPr>
+            <w:r>
+              <w:t xml:space="preserve">1.398</w:t>
+            </w:r>
+          </w:p>
+        </w:tc>
+        <w:tc>
+          <w:tcPr/>
+          <w:p>
+            <w:pPr>
+              <w:pStyle w:val="Compact"/>
+              <w:jc w:val="right"/>
+            </w:pPr>
+            <w:r>
+              <w:t xml:space="preserve">68</w:t>
+            </w:r>
+          </w:p>
+        </w:tc>
+        <w:tc>
+          <w:tcPr/>
+          <w:p>
+            <w:pPr>
+              <w:pStyle w:val="Compact"/>
+              <w:jc w:val="left"/>
+            </w:pPr>
+            <w:r>
+              <w:t xml:space="preserve">0.1666</w:t>
+            </w:r>
+          </w:p>
+        </w:tc>
+        <w:tc>
+          <w:tcPr/>
+          <w:p>
+            <w:pPr>
+              <w:pStyle w:val="Compact"/>
+              <w:jc w:val="right"/>
+            </w:pPr>
+            <w:r>
+              <w:t xml:space="preserve">0.270</w:t>
+            </w:r>
+          </w:p>
+        </w:tc>
+      </w:tr>
+      <w:tr>
+        <w:tc>
+          <w:tcPr/>
+          <w:p>
+            <w:pPr>
+              <w:pStyle w:val="Compact"/>
+              <w:jc w:val="left"/>
+            </w:pPr>
+            <w:r>
+              <w:t xml:space="preserve">Excluding any HAPPY-flagged runs</w:t>
+            </w:r>
+          </w:p>
+        </w:tc>
+        <w:tc>
+          <w:tcPr/>
+          <w:p>
+            <w:pPr>
+              <w:pStyle w:val="Compact"/>
+              <w:jc w:val="left"/>
+            </w:pPr>
+            <w:r>
+              <w:t xml:space="preserve">Self-Connected vs. Other</w:t>
+            </w:r>
+          </w:p>
+        </w:tc>
+        <w:tc>
+          <w:tcPr/>
+          <w:p>
+            <w:pPr>
+              <w:pStyle w:val="Compact"/>
+              <w:jc w:val="right"/>
+            </w:pPr>
+            <w:r>
+              <w:t xml:space="preserve">69</w:t>
+            </w:r>
+          </w:p>
+        </w:tc>
+        <w:tc>
+          <w:tcPr/>
+          <w:p>
+            <w:pPr>
+              <w:pStyle w:val="Compact"/>
+              <w:jc w:val="right"/>
+            </w:pPr>
+            <w:r>
+              <w:t xml:space="preserve">7.433</w:t>
+            </w:r>
+          </w:p>
+        </w:tc>
+        <w:tc>
+          <w:tcPr/>
+          <w:p>
+            <w:pPr>
+              <w:pStyle w:val="Compact"/>
+              <w:jc w:val="right"/>
+            </w:pPr>
+            <w:r>
+              <w:t xml:space="preserve">68</w:t>
+            </w:r>
+          </w:p>
+        </w:tc>
+        <w:tc>
+          <w:tcPr/>
+          <w:p>
+            <w:pPr>
+              <w:pStyle w:val="Compact"/>
+              <w:jc w:val="left"/>
+            </w:pPr>
+            <w:r>
+              <w:t xml:space="preserve">&lt; .001</w:t>
+            </w:r>
+          </w:p>
+        </w:tc>
+        <w:tc>
+          <w:tcPr/>
+          <w:p>
+            <w:pPr>
+              <w:pStyle w:val="Compact"/>
+              <w:jc w:val="right"/>
+            </w:pPr>
+            <w:r>
+              <w:t xml:space="preserve">1.236</w:t>
+            </w:r>
+          </w:p>
+        </w:tc>
+      </w:tr>
+      <w:tr>
+        <w:tc>
+          <w:tcPr/>
+          <w:p>
+            <w:pPr>
+              <w:pStyle w:val="Compact"/>
+              <w:jc w:val="left"/>
+            </w:pPr>
+            <w:r>
+              <w:t xml:space="preserve">Excluding any HAPPY-flagged runs</w:t>
+            </w:r>
+          </w:p>
+        </w:tc>
+        <w:tc>
+          <w:tcPr/>
+          <w:p>
+            <w:pPr>
+              <w:pStyle w:val="Compact"/>
+              <w:jc w:val="left"/>
+            </w:pPr>
+            <w:r>
+              <w:t xml:space="preserve">Self-Connected vs. Fixation-Cross</w:t>
+            </w:r>
+          </w:p>
+        </w:tc>
+        <w:tc>
+          <w:tcPr/>
+          <w:p>
+            <w:pPr>
+              <w:pStyle w:val="Compact"/>
+              <w:jc w:val="right"/>
+            </w:pPr>
+            <w:r>
+              <w:t xml:space="preserve">69</w:t>
+            </w:r>
+          </w:p>
+        </w:tc>
+        <w:tc>
+          <w:tcPr/>
+          <w:p>
+            <w:pPr>
+              <w:pStyle w:val="Compact"/>
+              <w:jc w:val="right"/>
+            </w:pPr>
+            <w:r>
+              <w:t xml:space="preserve">2.875</w:t>
+            </w:r>
+          </w:p>
+        </w:tc>
+        <w:tc>
+          <w:tcPr/>
+          <w:p>
+            <w:pPr>
+              <w:pStyle w:val="Compact"/>
+              <w:jc w:val="right"/>
+            </w:pPr>
+            <w:r>
+              <w:t xml:space="preserve">68</w:t>
+            </w:r>
+          </w:p>
+        </w:tc>
+        <w:tc>
+          <w:tcPr/>
+          <w:p>
+            <w:pPr>
+              <w:pStyle w:val="Compact"/>
+              <w:jc w:val="left"/>
+            </w:pPr>
+            <w:r>
+              <w:t xml:space="preserve">0.0054</w:t>
+            </w:r>
+          </w:p>
+        </w:tc>
+        <w:tc>
+          <w:tcPr/>
+          <w:p>
+            <w:pPr>
+              <w:pStyle w:val="Compact"/>
+              <w:jc w:val="right"/>
+            </w:pPr>
+            <w:r>
+              <w:t xml:space="preserve">0.496</w:t>
+            </w:r>
+          </w:p>
+        </w:tc>
+      </w:tr>
+    </w:tbl>
+    <w:p>
+      <w:pPr>
+        <w:pStyle w:val="BodyText"/>
+      </w:pPr>
+      <w:r>
+        <w:rPr>
+          <w:b/>
+          <w:bCs/>
+        </w:rPr>
+        <w:t xml:space="preserve">Results.</w:t>
+      </w:r>
+      <w:r>
+        <w:t xml:space="preserve"> </w:t>
+      </w:r>
+      <w:r>
+        <w:t xml:space="preserve">Using the full available HAPPY condition-specific sample (N = 73) – again substantially larger than the physio-only within-task sample – the following within-task comparison(s) remained significant at</w:t>
+      </w:r>
+      <w:r>
+        <w:t xml:space="preserve"> </w:t>
+      </w:r>
+      <w:r>
+        <w:rPr>
           <w:i/>
           <w:iCs/>
         </w:rPr>
+        <w:t xml:space="preserve">p</w:t>
+      </w:r>
+      <w:r>
+        <w:t xml:space="preserve"> </w:t>
+      </w:r>
+      <w:r>
+        <w:t xml:space="preserve">&lt; .05: Self-Connected vs. Other, Self-Connected vs. Fixation-Cross. The conclusion is unchanged whether HAPPY-flagged runs are excluded or not (see table). This only partially replicates the primary (physio-based) Aim 1b finding, where all three within-task comparisons were significant: Self-Connected vs. Self-Disconnected did not reach significance here.</w:t>
+      </w:r>
+    </w:p>
+    <w:p>
+      <w:pPr>
+        <w:pStyle w:val="BodyText"/>
+      </w:pPr>
+      <w:r>
+        <w:rPr>
+          <w:i/>
+          <w:iCs/>
+        </w:rPr>
         <w:t xml:space="preserve">Note on scope.</w:t>
       </w:r>
       <w:r>
         <w:t xml:space="preserve"> </w:t>
       </w:r>
       <w:r>
-        <w:t xml:space="preserve">HAPPY currently provides only overall resting and task heart rate, not the within-task condition breakdown (Self-Connected/Self-Disconnected/Other/Fixation-Cross); the within-task comparisons in Aim 1b have no HAPPY counterpart yet.</w:t>
+        <w:t xml:space="preserve">These HAPPY-derived condition means are not yet FDR-corrected as a family the way the primary physio-based comparisons are (Aim 1b); treat the full-sample numbers above as a replication check on the primary conclusion, not a stand-alone corrected test.</w:t>
       </w:r>
     </w:p>
-    <w:bookmarkEnd w:id="98"/>
-    <w:bookmarkEnd w:id="99"/>
-    <w:bookmarkStart w:id="102" w:name="cross-check"/>
+    <w:bookmarkEnd w:id="100"/>
+    <w:bookmarkEnd w:id="101"/>
+    <w:bookmarkEnd w:id="102"/>
+    <w:bookmarkStart w:id="105" w:name="cross-check"/>
     <w:p>
       <w:pPr>
         <w:pStyle w:val="Heading2"/>
@@ -72453,7 +73903,7 @@
         <w:t xml:space="preserve">Cross-Check</w:t>
       </w:r>
     </w:p>
-    <w:bookmarkStart w:id="100" w:name="sensitivity-analysis-cross-check"/>
+    <w:bookmarkStart w:id="103" w:name="sensitivity-analysis-cross-check"/>
     <w:p>
       <w:pPr>
         <w:pStyle w:val="Heading3"/>
@@ -73603,8 +75053,8 @@
         <w:t xml:space="preserve">entries indicate the biomarker changed significance status across the sensitivity conditions. CRP was significant in the illness-excluded and bleed+smoke-excluded analyses but not in the primary analysis; i.e., its reactivity result was sensitive to which participants were included, not stable across all three samples.</w:t>
       </w:r>
     </w:p>
-    <w:bookmarkEnd w:id="100"/>
-    <w:bookmarkStart w:id="101" w:name="quadratic-time-trend-cross-check"/>
+    <w:bookmarkEnd w:id="103"/>
+    <w:bookmarkStart w:id="104" w:name="quadratic-time-trend-cross-check"/>
     <w:p>
       <w:pPr>
         <w:pStyle w:val="Heading3"/>
@@ -74430,9 +75880,9 @@
         <w:t xml:space="preserve">denominators differ by biomarker group.</w:t>
       </w:r>
     </w:p>
-    <w:bookmarkEnd w:id="101"/>
-    <w:bookmarkEnd w:id="102"/>
-    <w:bookmarkEnd w:id="103"/>
+    <w:bookmarkEnd w:id="104"/>
+    <w:bookmarkEnd w:id="105"/>
+    <w:bookmarkEnd w:id="106"/>
     <w:sectPr/>
   </w:body>
 </w:document>

</xml_diff>